<commit_message>
fix: Update Mẫu 13 Giấy mời with ChuTri, ThoiGian tags and handle PGD role
</commit_message>
<xml_diff>
--- a/templates/TOTRINH/13_Mau_Giay_moi.docx
+++ b/templates/TOTRINH/13_Mau_Giay_moi.docx
@@ -881,21 +881,7 @@
         </w:rPr>
       </w:pPr>
       <w:r>
-        <w:rPr>
-          <w:rFonts w:ascii="Times New Roman" w:hAnsi="Times New Roman"/>
-          <w:szCs w:val="28"/>
-          <w:lang w:val="sv-SE"/>
-        </w:rPr>
-        <w:t>Chủ trì: ………………………</w:t>
-      </w:r>
-      <w:r>
-        <w:rPr>
-          <w:rFonts w:ascii="Times New Roman" w:hAnsi="Times New Roman"/>
-          <w:szCs w:val="28"/>
-          <w:lang w:val="sv-SE"/>
-        </w:rPr>
-        <w:tab/>
-        <w:t>………………………….……………….</w:t>
+        <w:t>Chủ trì: (CHUTRI)</w:t>
       </w:r>
     </w:p>
     <w:p>
@@ -915,21 +901,7 @@
         </w:rPr>
       </w:pPr>
       <w:r>
-        <w:rPr>
-          <w:rFonts w:ascii="Times New Roman" w:hAnsi="Times New Roman"/>
-          <w:szCs w:val="28"/>
-          <w:lang w:val="sv-SE"/>
-        </w:rPr>
-        <w:t>Thời gian:……</w:t>
-      </w:r>
-      <w:r>
-        <w:rPr>
-          <w:rFonts w:ascii="Times New Roman" w:hAnsi="Times New Roman"/>
-          <w:szCs w:val="28"/>
-          <w:lang w:val="sv-SE"/>
-        </w:rPr>
-        <w:tab/>
-        <w:t xml:space="preserve"> …………………………………………………….</w:t>
+        <w:t>Thời gian: (TIME)</w:t>
       </w:r>
     </w:p>
     <w:p>

</xml_diff>